<commit_message>
Fix 'Word found unreadable content' error on the 3 docs with placeholder figures
The placeholder-figure table cells set shading (w:shd) before borders
(w:tcBorders) in their w:tcPr. The OOXML schema for CT_TcPr requires
tcBorders to precede shd (and both to precede vAlign) - Word's strict
validator rejects the part outright when the sequence is wrong,
producing the unreadable-content/repair prompt on open.

Reordered to tcW -> tcBorders -> shd -> vAlign in the placeholder-
figure helper (affects all FUTURE placeholders too) and fixed the 45
already-inserted placeholder cells in place across Full GUI Manual,
Accretech and Electroglas Operation and Tips, and Running Nautilus.
Verified: no more out-of-schema-order tcPr children in any table in
any of the six docs, no duplicate relationship IDs, no missing
Content_Types media registrations, valid zip packages.

Co-Authored-By: Claude Sonnet 5 <noreply@anthropic.com>
</commit_message>
<xml_diff>
--- a/references/Manuals/Full GUI Manual.docx
+++ b/references/Manuals/Full GUI Manual.docx
@@ -7749,13 +7749,13 @@
         <w:tc>
           <w:tcPr>
             <w:tcW w:type="dxa" w:w="8640"/>
-            <w:shd w:val="clear" w:color="auto" w:fill="F2F2F2"/>
             <w:tcBorders>
               <w:top w:val="single" w:sz="8" w:space="0" w:color="999999"/>
               <w:left w:val="single" w:sz="8" w:space="0" w:color="999999"/>
               <w:bottom w:val="single" w:sz="8" w:space="0" w:color="999999"/>
               <w:right w:val="single" w:sz="8" w:space="0" w:color="999999"/>
             </w:tcBorders>
+            <w:shd w:val="clear" w:color="auto" w:fill="F2F2F2"/>
             <w:vAlign w:val="center"/>
           </w:tcPr>
           <w:p>
@@ -7818,13 +7818,13 @@
         <w:tc>
           <w:tcPr>
             <w:tcW w:type="dxa" w:w="8640"/>
-            <w:shd w:val="clear" w:color="auto" w:fill="F2F2F2"/>
             <w:tcBorders>
               <w:top w:val="single" w:sz="8" w:space="0" w:color="999999"/>
               <w:left w:val="single" w:sz="8" w:space="0" w:color="999999"/>
               <w:bottom w:val="single" w:sz="8" w:space="0" w:color="999999"/>
               <w:right w:val="single" w:sz="8" w:space="0" w:color="999999"/>
             </w:tcBorders>
+            <w:shd w:val="clear" w:color="auto" w:fill="F2F2F2"/>
             <w:vAlign w:val="center"/>
           </w:tcPr>
           <w:p>
@@ -7925,13 +7925,13 @@
         <w:tc>
           <w:tcPr>
             <w:tcW w:type="dxa" w:w="8640"/>
-            <w:shd w:val="clear" w:color="auto" w:fill="F2F2F2"/>
             <w:tcBorders>
               <w:top w:val="single" w:sz="8" w:space="0" w:color="999999"/>
               <w:left w:val="single" w:sz="8" w:space="0" w:color="999999"/>
               <w:bottom w:val="single" w:sz="8" w:space="0" w:color="999999"/>
               <w:right w:val="single" w:sz="8" w:space="0" w:color="999999"/>
             </w:tcBorders>
+            <w:shd w:val="clear" w:color="auto" w:fill="F2F2F2"/>
             <w:vAlign w:val="center"/>
           </w:tcPr>
           <w:p>
@@ -8004,13 +8004,13 @@
         <w:tc>
           <w:tcPr>
             <w:tcW w:type="dxa" w:w="8640"/>
-            <w:shd w:val="clear" w:color="auto" w:fill="F2F2F2"/>
             <w:tcBorders>
               <w:top w:val="single" w:sz="8" w:space="0" w:color="999999"/>
               <w:left w:val="single" w:sz="8" w:space="0" w:color="999999"/>
               <w:bottom w:val="single" w:sz="8" w:space="0" w:color="999999"/>
               <w:right w:val="single" w:sz="8" w:space="0" w:color="999999"/>
             </w:tcBorders>
+            <w:shd w:val="clear" w:color="auto" w:fill="F2F2F2"/>
             <w:vAlign w:val="center"/>
           </w:tcPr>
           <w:p>
@@ -8082,13 +8082,13 @@
         <w:tc>
           <w:tcPr>
             <w:tcW w:type="dxa" w:w="8640"/>
-            <w:shd w:val="clear" w:color="auto" w:fill="F2F2F2"/>
             <w:tcBorders>
               <w:top w:val="single" w:sz="8" w:space="0" w:color="999999"/>
               <w:left w:val="single" w:sz="8" w:space="0" w:color="999999"/>
               <w:bottom w:val="single" w:sz="8" w:space="0" w:color="999999"/>
               <w:right w:val="single" w:sz="8" w:space="0" w:color="999999"/>
             </w:tcBorders>
+            <w:shd w:val="clear" w:color="auto" w:fill="F2F2F2"/>
             <w:vAlign w:val="center"/>
           </w:tcPr>
           <w:p>
@@ -8145,13 +8145,13 @@
         <w:tc>
           <w:tcPr>
             <w:tcW w:type="dxa" w:w="8640"/>
-            <w:shd w:val="clear" w:color="auto" w:fill="F2F2F2"/>
             <w:tcBorders>
               <w:top w:val="single" w:sz="8" w:space="0" w:color="999999"/>
               <w:left w:val="single" w:sz="8" w:space="0" w:color="999999"/>
               <w:bottom w:val="single" w:sz="8" w:space="0" w:color="999999"/>
               <w:right w:val="single" w:sz="8" w:space="0" w:color="999999"/>
             </w:tcBorders>
+            <w:shd w:val="clear" w:color="auto" w:fill="F2F2F2"/>
             <w:vAlign w:val="center"/>
           </w:tcPr>
           <w:p>
@@ -8242,13 +8242,13 @@
         <w:tc>
           <w:tcPr>
             <w:tcW w:type="dxa" w:w="8640"/>
-            <w:shd w:val="clear" w:color="auto" w:fill="F2F2F2"/>
             <w:tcBorders>
               <w:top w:val="single" w:sz="8" w:space="0" w:color="999999"/>
               <w:left w:val="single" w:sz="8" w:space="0" w:color="999999"/>
               <w:bottom w:val="single" w:sz="8" w:space="0" w:color="999999"/>
               <w:right w:val="single" w:sz="8" w:space="0" w:color="999999"/>
             </w:tcBorders>
+            <w:shd w:val="clear" w:color="auto" w:fill="F2F2F2"/>
             <w:vAlign w:val="center"/>
           </w:tcPr>
           <w:p>
@@ -8317,13 +8317,13 @@
         <w:tc>
           <w:tcPr>
             <w:tcW w:type="dxa" w:w="8640"/>
-            <w:shd w:val="clear" w:color="auto" w:fill="F2F2F2"/>
             <w:tcBorders>
               <w:top w:val="single" w:sz="8" w:space="0" w:color="999999"/>
               <w:left w:val="single" w:sz="8" w:space="0" w:color="999999"/>
               <w:bottom w:val="single" w:sz="8" w:space="0" w:color="999999"/>
               <w:right w:val="single" w:sz="8" w:space="0" w:color="999999"/>
             </w:tcBorders>
+            <w:shd w:val="clear" w:color="auto" w:fill="F2F2F2"/>
             <w:vAlign w:val="center"/>
           </w:tcPr>
           <w:p>
@@ -8380,13 +8380,13 @@
         <w:tc>
           <w:tcPr>
             <w:tcW w:type="dxa" w:w="8640"/>
-            <w:shd w:val="clear" w:color="auto" w:fill="F2F2F2"/>
             <w:tcBorders>
               <w:top w:val="single" w:sz="8" w:space="0" w:color="999999"/>
               <w:left w:val="single" w:sz="8" w:space="0" w:color="999999"/>
               <w:bottom w:val="single" w:sz="8" w:space="0" w:color="999999"/>
               <w:right w:val="single" w:sz="8" w:space="0" w:color="999999"/>
             </w:tcBorders>
+            <w:shd w:val="clear" w:color="auto" w:fill="F2F2F2"/>
             <w:vAlign w:val="center"/>
           </w:tcPr>
           <w:p>
@@ -8455,13 +8455,13 @@
         <w:tc>
           <w:tcPr>
             <w:tcW w:type="dxa" w:w="8640"/>
-            <w:shd w:val="clear" w:color="auto" w:fill="F2F2F2"/>
             <w:tcBorders>
               <w:top w:val="single" w:sz="8" w:space="0" w:color="999999"/>
               <w:left w:val="single" w:sz="8" w:space="0" w:color="999999"/>
               <w:bottom w:val="single" w:sz="8" w:space="0" w:color="999999"/>
               <w:right w:val="single" w:sz="8" w:space="0" w:color="999999"/>
             </w:tcBorders>
+            <w:shd w:val="clear" w:color="auto" w:fill="F2F2F2"/>
             <w:vAlign w:val="center"/>
           </w:tcPr>
           <w:p>
@@ -8518,13 +8518,13 @@
         <w:tc>
           <w:tcPr>
             <w:tcW w:type="dxa" w:w="8640"/>
-            <w:shd w:val="clear" w:color="auto" w:fill="F2F2F2"/>
             <w:tcBorders>
               <w:top w:val="single" w:sz="8" w:space="0" w:color="999999"/>
               <w:left w:val="single" w:sz="8" w:space="0" w:color="999999"/>
               <w:bottom w:val="single" w:sz="8" w:space="0" w:color="999999"/>
               <w:right w:val="single" w:sz="8" w:space="0" w:color="999999"/>
             </w:tcBorders>
+            <w:shd w:val="clear" w:color="auto" w:fill="F2F2F2"/>
             <w:vAlign w:val="center"/>
           </w:tcPr>
           <w:p>
@@ -8593,13 +8593,13 @@
         <w:tc>
           <w:tcPr>
             <w:tcW w:type="dxa" w:w="8640"/>
-            <w:shd w:val="clear" w:color="auto" w:fill="F2F2F2"/>
             <w:tcBorders>
               <w:top w:val="single" w:sz="8" w:space="0" w:color="999999"/>
               <w:left w:val="single" w:sz="8" w:space="0" w:color="999999"/>
               <w:bottom w:val="single" w:sz="8" w:space="0" w:color="999999"/>
               <w:right w:val="single" w:sz="8" w:space="0" w:color="999999"/>
             </w:tcBorders>
+            <w:shd w:val="clear" w:color="auto" w:fill="F2F2F2"/>
             <w:vAlign w:val="center"/>
           </w:tcPr>
           <w:p>
@@ -8671,13 +8671,13 @@
         <w:tc>
           <w:tcPr>
             <w:tcW w:type="dxa" w:w="8640"/>
-            <w:shd w:val="clear" w:color="auto" w:fill="F2F2F2"/>
             <w:tcBorders>
               <w:top w:val="single" w:sz="8" w:space="0" w:color="999999"/>
               <w:left w:val="single" w:sz="8" w:space="0" w:color="999999"/>
               <w:bottom w:val="single" w:sz="8" w:space="0" w:color="999999"/>
               <w:right w:val="single" w:sz="8" w:space="0" w:color="999999"/>
             </w:tcBorders>
+            <w:shd w:val="clear" w:color="auto" w:fill="F2F2F2"/>
             <w:vAlign w:val="center"/>
           </w:tcPr>
           <w:p>
@@ -8791,13 +8791,13 @@
         <w:tc>
           <w:tcPr>
             <w:tcW w:type="dxa" w:w="8640"/>
-            <w:shd w:val="clear" w:color="auto" w:fill="F2F2F2"/>
             <w:tcBorders>
               <w:top w:val="single" w:sz="8" w:space="0" w:color="999999"/>
               <w:left w:val="single" w:sz="8" w:space="0" w:color="999999"/>
               <w:bottom w:val="single" w:sz="8" w:space="0" w:color="999999"/>
               <w:right w:val="single" w:sz="8" w:space="0" w:color="999999"/>
             </w:tcBorders>
+            <w:shd w:val="clear" w:color="auto" w:fill="F2F2F2"/>
             <w:vAlign w:val="center"/>
           </w:tcPr>
           <w:p>
@@ -8848,13 +8848,13 @@
         <w:tc>
           <w:tcPr>
             <w:tcW w:type="dxa" w:w="8640"/>
-            <w:shd w:val="clear" w:color="auto" w:fill="F2F2F2"/>
             <w:tcBorders>
               <w:top w:val="single" w:sz="8" w:space="0" w:color="999999"/>
               <w:left w:val="single" w:sz="8" w:space="0" w:color="999999"/>
               <w:bottom w:val="single" w:sz="8" w:space="0" w:color="999999"/>
               <w:right w:val="single" w:sz="8" w:space="0" w:color="999999"/>
             </w:tcBorders>
+            <w:shd w:val="clear" w:color="auto" w:fill="F2F2F2"/>
             <w:vAlign w:val="center"/>
           </w:tcPr>
           <w:p>
@@ -8911,13 +8911,13 @@
         <w:tc>
           <w:tcPr>
             <w:tcW w:type="dxa" w:w="8640"/>
-            <w:shd w:val="clear" w:color="auto" w:fill="F2F2F2"/>
             <w:tcBorders>
               <w:top w:val="single" w:sz="8" w:space="0" w:color="999999"/>
               <w:left w:val="single" w:sz="8" w:space="0" w:color="999999"/>
               <w:bottom w:val="single" w:sz="8" w:space="0" w:color="999999"/>
               <w:right w:val="single" w:sz="8" w:space="0" w:color="999999"/>
             </w:tcBorders>
+            <w:shd w:val="clear" w:color="auto" w:fill="F2F2F2"/>
             <w:vAlign w:val="center"/>
           </w:tcPr>
           <w:p>
@@ -8986,13 +8986,13 @@
         <w:tc>
           <w:tcPr>
             <w:tcW w:type="dxa" w:w="8640"/>
-            <w:shd w:val="clear" w:color="auto" w:fill="F2F2F2"/>
             <w:tcBorders>
               <w:top w:val="single" w:sz="8" w:space="0" w:color="999999"/>
               <w:left w:val="single" w:sz="8" w:space="0" w:color="999999"/>
               <w:bottom w:val="single" w:sz="8" w:space="0" w:color="999999"/>
               <w:right w:val="single" w:sz="8" w:space="0" w:color="999999"/>
             </w:tcBorders>
+            <w:shd w:val="clear" w:color="auto" w:fill="F2F2F2"/>
             <w:vAlign w:val="center"/>
           </w:tcPr>
           <w:p>
@@ -9049,13 +9049,13 @@
         <w:tc>
           <w:tcPr>
             <w:tcW w:type="dxa" w:w="8640"/>
-            <w:shd w:val="clear" w:color="auto" w:fill="F2F2F2"/>
             <w:tcBorders>
               <w:top w:val="single" w:sz="8" w:space="0" w:color="999999"/>
               <w:left w:val="single" w:sz="8" w:space="0" w:color="999999"/>
               <w:bottom w:val="single" w:sz="8" w:space="0" w:color="999999"/>
               <w:right w:val="single" w:sz="8" w:space="0" w:color="999999"/>
             </w:tcBorders>
+            <w:shd w:val="clear" w:color="auto" w:fill="F2F2F2"/>
             <w:vAlign w:val="center"/>
           </w:tcPr>
           <w:p>
@@ -9112,13 +9112,13 @@
         <w:tc>
           <w:tcPr>
             <w:tcW w:type="dxa" w:w="8640"/>
-            <w:shd w:val="clear" w:color="auto" w:fill="F2F2F2"/>
             <w:tcBorders>
               <w:top w:val="single" w:sz="8" w:space="0" w:color="999999"/>
               <w:left w:val="single" w:sz="8" w:space="0" w:color="999999"/>
               <w:bottom w:val="single" w:sz="8" w:space="0" w:color="999999"/>
               <w:right w:val="single" w:sz="8" w:space="0" w:color="999999"/>
             </w:tcBorders>
+            <w:shd w:val="clear" w:color="auto" w:fill="F2F2F2"/>
             <w:vAlign w:val="center"/>
           </w:tcPr>
           <w:p>
@@ -9178,13 +9178,13 @@
         <w:tc>
           <w:tcPr>
             <w:tcW w:type="dxa" w:w="8640"/>
-            <w:shd w:val="clear" w:color="auto" w:fill="F2F2F2"/>
             <w:tcBorders>
               <w:top w:val="single" w:sz="8" w:space="0" w:color="999999"/>
               <w:left w:val="single" w:sz="8" w:space="0" w:color="999999"/>
               <w:bottom w:val="single" w:sz="8" w:space="0" w:color="999999"/>
               <w:right w:val="single" w:sz="8" w:space="0" w:color="999999"/>
             </w:tcBorders>
+            <w:shd w:val="clear" w:color="auto" w:fill="F2F2F2"/>
             <w:vAlign w:val="center"/>
           </w:tcPr>
           <w:p>
@@ -9235,13 +9235,13 @@
         <w:tc>
           <w:tcPr>
             <w:tcW w:type="dxa" w:w="8640"/>
-            <w:shd w:val="clear" w:color="auto" w:fill="F2F2F2"/>
             <w:tcBorders>
               <w:top w:val="single" w:sz="8" w:space="0" w:color="999999"/>
               <w:left w:val="single" w:sz="8" w:space="0" w:color="999999"/>
               <w:bottom w:val="single" w:sz="8" w:space="0" w:color="999999"/>
               <w:right w:val="single" w:sz="8" w:space="0" w:color="999999"/>
             </w:tcBorders>
+            <w:shd w:val="clear" w:color="auto" w:fill="F2F2F2"/>
             <w:vAlign w:val="center"/>
           </w:tcPr>
           <w:p>
@@ -9310,13 +9310,13 @@
         <w:tc>
           <w:tcPr>
             <w:tcW w:type="dxa" w:w="8640"/>
-            <w:shd w:val="clear" w:color="auto" w:fill="F2F2F2"/>
             <w:tcBorders>
               <w:top w:val="single" w:sz="8" w:space="0" w:color="999999"/>
               <w:left w:val="single" w:sz="8" w:space="0" w:color="999999"/>
               <w:bottom w:val="single" w:sz="8" w:space="0" w:color="999999"/>
               <w:right w:val="single" w:sz="8" w:space="0" w:color="999999"/>
             </w:tcBorders>
+            <w:shd w:val="clear" w:color="auto" w:fill="F2F2F2"/>
             <w:vAlign w:val="center"/>
           </w:tcPr>
           <w:p>
@@ -9376,13 +9376,13 @@
         <w:tc>
           <w:tcPr>
             <w:tcW w:type="dxa" w:w="8640"/>
-            <w:shd w:val="clear" w:color="auto" w:fill="F2F2F2"/>
             <w:tcBorders>
               <w:top w:val="single" w:sz="8" w:space="0" w:color="999999"/>
               <w:left w:val="single" w:sz="8" w:space="0" w:color="999999"/>
               <w:bottom w:val="single" w:sz="8" w:space="0" w:color="999999"/>
               <w:right w:val="single" w:sz="8" w:space="0" w:color="999999"/>
             </w:tcBorders>
+            <w:shd w:val="clear" w:color="auto" w:fill="F2F2F2"/>
             <w:vAlign w:val="center"/>
           </w:tcPr>
           <w:p>
@@ -9445,13 +9445,13 @@
         <w:tc>
           <w:tcPr>
             <w:tcW w:type="dxa" w:w="8640"/>
-            <w:shd w:val="clear" w:color="auto" w:fill="F2F2F2"/>
             <w:tcBorders>
               <w:top w:val="single" w:sz="8" w:space="0" w:color="999999"/>
               <w:left w:val="single" w:sz="8" w:space="0" w:color="999999"/>
               <w:bottom w:val="single" w:sz="8" w:space="0" w:color="999999"/>
               <w:right w:val="single" w:sz="8" w:space="0" w:color="999999"/>
             </w:tcBorders>
+            <w:shd w:val="clear" w:color="auto" w:fill="F2F2F2"/>
             <w:vAlign w:val="center"/>
           </w:tcPr>
           <w:p>
@@ -9508,13 +9508,13 @@
         <w:tc>
           <w:tcPr>
             <w:tcW w:type="dxa" w:w="8640"/>
-            <w:shd w:val="clear" w:color="auto" w:fill="F2F2F2"/>
             <w:tcBorders>
               <w:top w:val="single" w:sz="8" w:space="0" w:color="999999"/>
               <w:left w:val="single" w:sz="8" w:space="0" w:color="999999"/>
               <w:bottom w:val="single" w:sz="8" w:space="0" w:color="999999"/>
               <w:right w:val="single" w:sz="8" w:space="0" w:color="999999"/>
             </w:tcBorders>
+            <w:shd w:val="clear" w:color="auto" w:fill="F2F2F2"/>
             <w:vAlign w:val="center"/>
           </w:tcPr>
           <w:p>
@@ -9571,13 +9571,13 @@
         <w:tc>
           <w:tcPr>
             <w:tcW w:type="dxa" w:w="8640"/>
-            <w:shd w:val="clear" w:color="auto" w:fill="F2F2F2"/>
             <w:tcBorders>
               <w:top w:val="single" w:sz="8" w:space="0" w:color="999999"/>
               <w:left w:val="single" w:sz="8" w:space="0" w:color="999999"/>
               <w:bottom w:val="single" w:sz="8" w:space="0" w:color="999999"/>
               <w:right w:val="single" w:sz="8" w:space="0" w:color="999999"/>
             </w:tcBorders>
+            <w:shd w:val="clear" w:color="auto" w:fill="F2F2F2"/>
             <w:vAlign w:val="center"/>
           </w:tcPr>
           <w:p>
@@ -9634,13 +9634,13 @@
         <w:tc>
           <w:tcPr>
             <w:tcW w:type="dxa" w:w="8640"/>
-            <w:shd w:val="clear" w:color="auto" w:fill="F2F2F2"/>
             <w:tcBorders>
               <w:top w:val="single" w:sz="8" w:space="0" w:color="999999"/>
               <w:left w:val="single" w:sz="8" w:space="0" w:color="999999"/>
               <w:bottom w:val="single" w:sz="8" w:space="0" w:color="999999"/>
               <w:right w:val="single" w:sz="8" w:space="0" w:color="999999"/>
             </w:tcBorders>
+            <w:shd w:val="clear" w:color="auto" w:fill="F2F2F2"/>
             <w:vAlign w:val="center"/>
           </w:tcPr>
           <w:p>
@@ -9731,13 +9731,13 @@
         <w:tc>
           <w:tcPr>
             <w:tcW w:type="dxa" w:w="8640"/>
-            <w:shd w:val="clear" w:color="auto" w:fill="F2F2F2"/>
             <w:tcBorders>
               <w:top w:val="single" w:sz="8" w:space="0" w:color="999999"/>
               <w:left w:val="single" w:sz="8" w:space="0" w:color="999999"/>
               <w:bottom w:val="single" w:sz="8" w:space="0" w:color="999999"/>
               <w:right w:val="single" w:sz="8" w:space="0" w:color="999999"/>
             </w:tcBorders>
+            <w:shd w:val="clear" w:color="auto" w:fill="F2F2F2"/>
             <w:vAlign w:val="center"/>
           </w:tcPr>
           <w:p>
@@ -9842,13 +9842,13 @@
         <w:tc>
           <w:tcPr>
             <w:tcW w:type="dxa" w:w="8640"/>
-            <w:shd w:val="clear" w:color="auto" w:fill="F2F2F2"/>
             <w:tcBorders>
               <w:top w:val="single" w:sz="8" w:space="0" w:color="999999"/>
               <w:left w:val="single" w:sz="8" w:space="0" w:color="999999"/>
               <w:bottom w:val="single" w:sz="8" w:space="0" w:color="999999"/>
               <w:right w:val="single" w:sz="8" w:space="0" w:color="999999"/>
             </w:tcBorders>
+            <w:shd w:val="clear" w:color="auto" w:fill="F2F2F2"/>
             <w:vAlign w:val="center"/>
           </w:tcPr>
           <w:p>
@@ -9905,13 +9905,13 @@
         <w:tc>
           <w:tcPr>
             <w:tcW w:type="dxa" w:w="8640"/>
-            <w:shd w:val="clear" w:color="auto" w:fill="F2F2F2"/>
             <w:tcBorders>
               <w:top w:val="single" w:sz="8" w:space="0" w:color="999999"/>
               <w:left w:val="single" w:sz="8" w:space="0" w:color="999999"/>
               <w:bottom w:val="single" w:sz="8" w:space="0" w:color="999999"/>
               <w:right w:val="single" w:sz="8" w:space="0" w:color="999999"/>
             </w:tcBorders>
+            <w:shd w:val="clear" w:color="auto" w:fill="F2F2F2"/>
             <w:vAlign w:val="center"/>
           </w:tcPr>
           <w:p>
@@ -9968,13 +9968,13 @@
         <w:tc>
           <w:tcPr>
             <w:tcW w:type="dxa" w:w="8640"/>
-            <w:shd w:val="clear" w:color="auto" w:fill="F2F2F2"/>
             <w:tcBorders>
               <w:top w:val="single" w:sz="8" w:space="0" w:color="999999"/>
               <w:left w:val="single" w:sz="8" w:space="0" w:color="999999"/>
               <w:bottom w:val="single" w:sz="8" w:space="0" w:color="999999"/>
               <w:right w:val="single" w:sz="8" w:space="0" w:color="999999"/>
             </w:tcBorders>
+            <w:shd w:val="clear" w:color="auto" w:fill="F2F2F2"/>
             <w:vAlign w:val="center"/>
           </w:tcPr>
           <w:p>
@@ -10031,13 +10031,13 @@
         <w:tc>
           <w:tcPr>
             <w:tcW w:type="dxa" w:w="8640"/>
-            <w:shd w:val="clear" w:color="auto" w:fill="F2F2F2"/>
             <w:tcBorders>
               <w:top w:val="single" w:sz="8" w:space="0" w:color="999999"/>
               <w:left w:val="single" w:sz="8" w:space="0" w:color="999999"/>
               <w:bottom w:val="single" w:sz="8" w:space="0" w:color="999999"/>
               <w:right w:val="single" w:sz="8" w:space="0" w:color="999999"/>
             </w:tcBorders>
+            <w:shd w:val="clear" w:color="auto" w:fill="F2F2F2"/>
             <w:vAlign w:val="center"/>
           </w:tcPr>
           <w:p>

</xml_diff>

<commit_message>
Remove Purpose/Scope/References/Responsibilities from all six manuals
Same front-matter block (Purpose, Scope, References + Definitions
table, Responsibilities) removed from all six documents, keeping the
title-info block and Approver table above it. Full GUI Manual's
Table of Contents naturally ends up right after the cover block now
that the section it used to follow is gone.

Verified via real Word COM automation: all six open clean, no
leftover Purpose/Scope/References/Responsibilities headings.

Co-Authored-By: Claude Sonnet 5 <noreply@anthropic.com>
</commit_message>
<xml_diff>
--- a/references/Manuals/Full GUI Manual.docx
+++ b/references/Manuals/Full GUI Manual.docx
@@ -1468,1388 +1468,6 @@
                     <pic:pic>
                       <pic:nvPicPr>
                         <pic:cNvPr id="0" name="image19.png"/>
-                        <pic:cNvPicPr preferRelativeResize="0"/>
-                      </pic:nvPicPr>
-                      <pic:blipFill>
-                        <a:blip r:embed="rId7"/>
-                        <a:srcRect/>
-                        <a:stretch>
-                          <a:fillRect/>
-                        </a:stretch>
-                      </pic:blipFill>
-                      <pic:spPr>
-                        <a:xfrm>
-                          <a:off x="0" y="0"/>
-                          <a:ext cx="6130925" cy="31750"/>
-                        </a:xfrm>
-                        <a:prstGeom prst="rect"/>
-                        <a:ln/>
-                      </pic:spPr>
-                    </pic:pic>
-                  </a:graphicData>
-                </a:graphic>
-              </wp:anchor>
-            </w:drawing>
-          </mc:Fallback>
-        </mc:AlternateContent>
-      </w:r>
-    </w:p>
-    <w:p>
-      <w:pPr>
-        <w:keepNext w:val="0"/>
-        <w:keepLines w:val="0"/>
-        <w:pageBreakBefore w:val="0"/>
-        <w:widowControl w:val="0"/>
-        <w:pBdr>
-          <w:top w:space="0" w:sz="0" w:val="nil"/>
-          <w:left w:space="0" w:sz="0" w:val="nil"/>
-          <w:bottom w:space="0" w:sz="0" w:val="nil"/>
-          <w:right w:space="0" w:sz="0" w:val="nil"/>
-          <w:between w:space="0" w:sz="0" w:val="nil"/>
-        </w:pBdr>
-        <w:shd w:fill="auto" w:val="clear"/>
-        <w:spacing w:after="0" w:before="0" w:line="240" w:lineRule="auto"/>
-        <w:ind w:left="0" w:right="0" w:firstLine="0"/>
-        <w:jc w:val="left"/>
-        <w:rPr>
-          <w:rFonts w:ascii="Arial" w:cs="Arial" w:eastAsia="Arial" w:hAnsi="Arial"/>
-          <w:b w:val="0"/>
-          <w:bCs w:val="0"/>
-          <w:i w:val="0"/>
-          <w:iCs w:val="0"/>
-          <w:smallCaps w:val="0"/>
-          <w:strike w:val="0"/>
-          <w:color w:val="000000"/>
-          <w:sz w:val="33"/>
-          <w:szCs w:val="33"/>
-          <w:u w:val="none"/>
-          <w:shd w:fill="auto" w:val="clear"/>
-          <w:vertAlign w:val="baseline"/>
-        </w:rPr>
-      </w:pPr>
-      <w:r>
-        <w:rPr>
-          <w:rtl w:val="0"/>
-        </w:rPr>
-      </w:r>
-    </w:p>
-    <w:p>
-      <w:pPr>
-        <w:keepNext w:val="0"/>
-        <w:keepLines w:val="0"/>
-        <w:pageBreakBefore w:val="0"/>
-        <w:widowControl w:val="0"/>
-        <w:pBdr>
-          <w:top w:space="0" w:sz="0" w:val="nil"/>
-          <w:left w:space="0" w:sz="0" w:val="nil"/>
-          <w:bottom w:space="0" w:sz="0" w:val="nil"/>
-          <w:right w:space="0" w:sz="0" w:val="nil"/>
-          <w:between w:space="0" w:sz="0" w:val="nil"/>
-        </w:pBdr>
-        <w:shd w:fill="auto" w:val="clear"/>
-        <w:spacing w:after="0" w:before="62" w:line="240" w:lineRule="auto"/>
-        <w:ind w:left="0" w:right="0" w:firstLine="0"/>
-        <w:jc w:val="left"/>
-        <w:rPr>
-          <w:rFonts w:ascii="Arial" w:cs="Arial" w:eastAsia="Arial" w:hAnsi="Arial"/>
-          <w:b w:val="0"/>
-          <w:bCs w:val="0"/>
-          <w:i w:val="0"/>
-          <w:iCs w:val="0"/>
-          <w:smallCaps w:val="0"/>
-          <w:strike w:val="0"/>
-          <w:color w:val="000000"/>
-          <w:sz w:val="33"/>
-          <w:szCs w:val="33"/>
-          <w:u w:val="none"/>
-          <w:shd w:fill="auto" w:val="clear"/>
-          <w:vertAlign w:val="baseline"/>
-        </w:rPr>
-      </w:pPr>
-      <w:r>
-        <w:rPr>
-          <w:rtl w:val="0"/>
-        </w:rPr>
-      </w:r>
-    </w:p>
-    <w:p>
-      <w:pPr>
-        <w:pStyle w:val="Heading1"/>
-        <w:numPr>
-          <w:ilvl w:val="0"/>
-          <w:numId w:val="1"/>
-        </w:numPr>
-        <w:tabs>
-          <w:tab w:val="left" w:leader="none" w:pos="696"/>
-        </w:tabs>
-        <w:ind w:left="696" w:hanging="370"/>
-        <w:rPr/>
-      </w:pPr>
-      <w:r>
-        <w:rPr>
-          <w:rtl w:val="0"/>
-        </w:rPr>
-        <w:t xml:space="preserve">Purpose</w:t>
-      </w:r>
-    </w:p>
-    <w:p>
-      <w:pPr>
-        <w:keepNext w:val="0"/>
-        <w:keepLines w:val="0"/>
-        <w:pageBreakBefore w:val="0"/>
-        <w:widowControl w:val="0"/>
-        <w:pBdr>
-          <w:top w:space="0" w:sz="0" w:val="nil"/>
-          <w:left w:space="0" w:sz="0" w:val="nil"/>
-          <w:bottom w:space="0" w:sz="0" w:val="nil"/>
-          <w:right w:space="0" w:sz="0" w:val="nil"/>
-          <w:between w:space="0" w:sz="0" w:val="nil"/>
-        </w:pBdr>
-        <w:shd w:fill="auto" w:val="clear"/>
-        <w:spacing w:after="0" w:before="87" w:line="271" w:lineRule="auto"/>
-        <w:ind w:left="326" w:right="0" w:firstLine="0"/>
-        <w:jc w:val="left"/>
-        <w:rPr>
-          <w:rFonts w:ascii="Arial" w:cs="Arial" w:eastAsia="Arial" w:hAnsi="Arial"/>
-          <w:b w:val="0"/>
-          <w:bCs w:val="0"/>
-          <w:i w:val="0"/>
-          <w:iCs w:val="0"/>
-          <w:smallCaps w:val="0"/>
-          <w:strike w:val="0"/>
-          <w:color w:val="000000"/>
-          <w:sz w:val="21"/>
-          <w:szCs w:val="21"/>
-          <w:u w:val="none"/>
-          <w:shd w:fill="auto" w:val="clear"/>
-          <w:vertAlign w:val="baseline"/>
-        </w:rPr>
-      </w:pPr>
-      <w:r>
-        <w:rPr>
-          <w:rFonts w:ascii="Arial" w:cs="Arial" w:eastAsia="Arial" w:hAnsi="Arial"/>
-          <w:b w:val="0"/>
-          <w:bCs w:val="0"/>
-          <w:i w:val="0"/>
-          <w:iCs w:val="0"/>
-          <w:smallCaps w:val="0"/>
-          <w:strike w:val="0"/>
-          <w:color w:val="000000"/>
-          <w:sz w:val="21"/>
-          <w:szCs w:val="21"/>
-          <w:u w:val="none"/>
-          <w:shd w:fill="auto" w:val="clear"/>
-          <w:vertAlign w:val="baseline"/>
-          <w:rtl w:val="0"/>
-        </w:rPr>
-        <w:t xml:space="preserve">The purpose of this document is to provide instructions for </w:t>
-      </w:r>
-      <w:r>
-        <w:rPr>
-          <w:sz w:val="21"/>
-          <w:szCs w:val="21"/>
-          <w:rtl w:val="0"/>
-        </w:rPr>
-        <w:t xml:space="preserve">using GUI for recipe creation, wafer map generation, and setting up for the Accretech and Electroglas electrical probers. Furthermore, there will be a section on NanoZ for the Nautilus project specifically. </w:t>
-      </w:r>
-      <w:r>
-        <w:rPr>
-          <w:rtl w:val="0"/>
-        </w:rPr>
-      </w:r>
-    </w:p>
-    <w:p>
-      <w:pPr>
-        <w:keepNext w:val="0"/>
-        <w:keepLines w:val="0"/>
-        <w:pageBreakBefore w:val="0"/>
-        <w:widowControl w:val="0"/>
-        <w:pBdr>
-          <w:top w:space="0" w:sz="0" w:val="nil"/>
-          <w:left w:space="0" w:sz="0" w:val="nil"/>
-          <w:bottom w:space="0" w:sz="0" w:val="nil"/>
-          <w:right w:space="0" w:sz="0" w:val="nil"/>
-          <w:between w:space="0" w:sz="0" w:val="nil"/>
-        </w:pBdr>
-        <w:shd w:fill="auto" w:val="clear"/>
-        <w:spacing w:after="0" w:before="128" w:line="240" w:lineRule="auto"/>
-        <w:ind w:left="0" w:right="0" w:firstLine="0"/>
-        <w:jc w:val="left"/>
-        <w:rPr>
-          <w:rFonts w:ascii="Arial" w:cs="Arial" w:eastAsia="Arial" w:hAnsi="Arial"/>
-          <w:b w:val="0"/>
-          <w:bCs w:val="0"/>
-          <w:i w:val="0"/>
-          <w:iCs w:val="0"/>
-          <w:smallCaps w:val="0"/>
-          <w:strike w:val="0"/>
-          <w:color w:val="000000"/>
-          <w:sz w:val="21"/>
-          <w:szCs w:val="21"/>
-          <w:u w:val="none"/>
-          <w:shd w:fill="auto" w:val="clear"/>
-          <w:vertAlign w:val="baseline"/>
-        </w:rPr>
-      </w:pPr>
-      <w:r>
-        <w:rPr>
-          <w:rtl w:val="0"/>
-        </w:rPr>
-      </w:r>
-    </w:p>
-    <w:p>
-      <w:pPr>
-        <w:pStyle w:val="Heading1"/>
-        <w:pageBreakBefore/>
-        <w:numPr>
-          <w:ilvl w:val="0"/>
-          <w:numId w:val="1"/>
-        </w:numPr>
-        <w:tabs>
-          <w:tab w:val="left" w:leader="none" w:pos="696"/>
-        </w:tabs>
-        <w:spacing w:before="1" w:lineRule="auto"/>
-        <w:ind w:left="696" w:hanging="370"/>
-        <w:rPr/>
-      </w:pPr>
-      <w:r>
-        <w:rPr>
-          <w:rtl w:val="0"/>
-        </w:rPr>
-        <w:t xml:space="preserve">Scope</w:t>
-      </w:r>
-    </w:p>
-    <w:p>
-      <w:pPr>
-        <w:keepNext w:val="0"/>
-        <w:keepLines w:val="0"/>
-        <w:pageBreakBefore w:val="0"/>
-        <w:widowControl w:val="0"/>
-        <w:pBdr>
-          <w:top w:space="0" w:sz="0" w:val="nil"/>
-          <w:left w:space="0" w:sz="0" w:val="nil"/>
-          <w:bottom w:space="0" w:sz="0" w:val="nil"/>
-          <w:right w:space="0" w:sz="0" w:val="nil"/>
-          <w:between w:space="0" w:sz="0" w:val="nil"/>
-        </w:pBdr>
-        <w:shd w:fill="auto" w:val="clear"/>
-        <w:spacing w:after="0" w:before="19" w:line="240" w:lineRule="auto"/>
-        <w:ind w:left="0" w:right="0" w:firstLine="0"/>
-        <w:jc w:val="left"/>
-        <w:rPr>
-          <w:rFonts w:ascii="Arial Black" w:cs="Arial Black" w:eastAsia="Arial Black" w:hAnsi="Arial Black"/>
-          <w:b w:val="0"/>
-          <w:bCs w:val="0"/>
-          <w:i w:val="0"/>
-          <w:iCs w:val="0"/>
-          <w:smallCaps w:val="0"/>
-          <w:strike w:val="0"/>
-          <w:color w:val="000000"/>
-          <w:sz w:val="21"/>
-          <w:szCs w:val="21"/>
-          <w:u w:val="none"/>
-          <w:shd w:fill="auto" w:val="clear"/>
-          <w:vertAlign w:val="baseline"/>
-        </w:rPr>
-      </w:pPr>
-      <w:r>
-        <w:rPr>
-          <w:rtl w:val="0"/>
-        </w:rPr>
-      </w:r>
-    </w:p>
-    <w:p>
-      <w:pPr>
-        <w:keepNext w:val="0"/>
-        <w:keepLines w:val="0"/>
-        <w:pageBreakBefore w:val="0"/>
-        <w:widowControl w:val="0"/>
-        <w:numPr>
-          <w:ilvl w:val="1"/>
-          <w:numId w:val="1"/>
-        </w:numPr>
-        <w:pBdr>
-          <w:top w:space="0" w:sz="0" w:val="nil"/>
-          <w:left w:space="0" w:sz="0" w:val="nil"/>
-          <w:bottom w:space="0" w:sz="0" w:val="nil"/>
-          <w:right w:space="0" w:sz="0" w:val="nil"/>
-          <w:between w:space="0" w:sz="0" w:val="nil"/>
-        </w:pBdr>
-        <w:shd w:fill="auto" w:val="clear"/>
-        <w:tabs>
-          <w:tab w:val="left" w:leader="none" w:pos="1015"/>
-          <w:tab w:val="left" w:leader="none" w:pos="1019"/>
-        </w:tabs>
-        <w:spacing w:after="0" w:before="0" w:line="297" w:lineRule="auto"/>
-        <w:ind w:left="1019" w:right="757" w:hanging="457"/>
-        <w:jc w:val="left"/>
-        <w:rPr>
-          <w:rFonts w:ascii="Arial" w:cs="Arial" w:eastAsia="Arial" w:hAnsi="Arial"/>
-          <w:b w:val="0"/>
-          <w:bCs w:val="0"/>
-          <w:i w:val="0"/>
-          <w:iCs w:val="0"/>
-          <w:smallCaps w:val="0"/>
-          <w:strike w:val="0"/>
-          <w:color w:val="000000"/>
-          <w:sz w:val="21"/>
-          <w:szCs w:val="21"/>
-          <w:u w:val="none"/>
-          <w:shd w:fill="auto" w:val="clear"/>
-          <w:vertAlign w:val="baseline"/>
-        </w:rPr>
-      </w:pPr>
-      <w:r>
-        <w:rPr>
-          <w:rFonts w:ascii="Arial" w:cs="Arial" w:eastAsia="Arial" w:hAnsi="Arial"/>
-          <w:b w:val="0"/>
-          <w:bCs w:val="0"/>
-          <w:i w:val="0"/>
-          <w:iCs w:val="0"/>
-          <w:smallCaps w:val="0"/>
-          <w:strike w:val="0"/>
-          <w:color w:val="13151a"/>
-          <w:sz w:val="21"/>
-          <w:szCs w:val="21"/>
-          <w:u w:val="none"/>
-          <w:shd w:fill="auto" w:val="clear"/>
-          <w:vertAlign w:val="baseline"/>
-          <w:rtl w:val="0"/>
-        </w:rPr>
-        <w:t xml:space="preserve">This procedure is designed for any personnel </w:t>
-      </w:r>
-      <w:r>
-        <w:rPr>
-          <w:color w:val="13151a"/>
-          <w:sz w:val="21"/>
-          <w:szCs w:val="21"/>
-          <w:rtl w:val="0"/>
-        </w:rPr>
-        <w:t xml:space="preserve">designing recipes or trying to do electrical probing on new programs.</w:t>
-      </w:r>
-      <w:r>
-        <w:rPr>
-          <w:rtl w:val="0"/>
-        </w:rPr>
-      </w:r>
-    </w:p>
-    <w:p>
-      <w:pPr>
-        <w:keepNext w:val="0"/>
-        <w:keepLines w:val="0"/>
-        <w:pageBreakBefore w:val="0"/>
-        <w:widowControl w:val="0"/>
-        <w:pBdr>
-          <w:top w:space="0" w:sz="0" w:val="nil"/>
-          <w:left w:space="0" w:sz="0" w:val="nil"/>
-          <w:bottom w:space="0" w:sz="0" w:val="nil"/>
-          <w:right w:space="0" w:sz="0" w:val="nil"/>
-          <w:between w:space="0" w:sz="0" w:val="nil"/>
-        </w:pBdr>
-        <w:shd w:fill="auto" w:val="clear"/>
-        <w:spacing w:after="0" w:before="68" w:line="240" w:lineRule="auto"/>
-        <w:ind w:left="0" w:right="0" w:firstLine="0"/>
-        <w:jc w:val="left"/>
-        <w:rPr>
-          <w:rFonts w:ascii="Arial" w:cs="Arial" w:eastAsia="Arial" w:hAnsi="Arial"/>
-          <w:b w:val="0"/>
-          <w:bCs w:val="0"/>
-          <w:i w:val="0"/>
-          <w:iCs w:val="0"/>
-          <w:smallCaps w:val="0"/>
-          <w:strike w:val="0"/>
-          <w:color w:val="000000"/>
-          <w:sz w:val="33"/>
-          <w:szCs w:val="33"/>
-          <w:u w:val="none"/>
-          <w:shd w:fill="auto" w:val="clear"/>
-          <w:vertAlign w:val="baseline"/>
-        </w:rPr>
-      </w:pPr>
-      <w:r>
-        <w:rPr>
-          <w:rtl w:val="0"/>
-        </w:rPr>
-      </w:r>
-    </w:p>
-    <w:p>
-      <w:pPr>
-        <w:pStyle w:val="Heading1"/>
-        <w:pageBreakBefore/>
-        <w:numPr>
-          <w:ilvl w:val="0"/>
-          <w:numId w:val="1"/>
-        </w:numPr>
-        <w:tabs>
-          <w:tab w:val="left" w:leader="none" w:pos="696"/>
-        </w:tabs>
-        <w:ind w:left="696" w:hanging="370"/>
-        <w:rPr/>
-      </w:pPr>
-      <w:r>
-        <w:rPr>
-          <w:rtl w:val="0"/>
-        </w:rPr>
-        <w:t xml:space="preserve">References</w:t>
-      </w:r>
-      <w:r>
-        <w:rPr>
-          <w:rtl w:val="0"/>
-        </w:rPr>
-      </w:r>
-    </w:p>
-    <w:p>
-      <w:pPr>
-        <w:keepNext w:val="0"/>
-        <w:keepLines w:val="0"/>
-        <w:pageBreakBefore w:val="0"/>
-        <w:widowControl w:val="0"/>
-        <w:pBdr>
-          <w:top w:space="0" w:sz="0" w:val="nil"/>
-          <w:left w:space="0" w:sz="0" w:val="nil"/>
-          <w:bottom w:space="0" w:sz="0" w:val="nil"/>
-          <w:right w:space="0" w:sz="0" w:val="nil"/>
-          <w:between w:space="0" w:sz="0" w:val="nil"/>
-        </w:pBdr>
-        <w:shd w:fill="auto" w:val="clear"/>
-        <w:spacing w:after="0" w:before="67" w:line="240" w:lineRule="auto"/>
-        <w:ind w:left="0" w:right="0" w:firstLine="0"/>
-        <w:jc w:val="left"/>
-        <w:rPr>
-          <w:rFonts w:ascii="Arial" w:cs="Arial" w:eastAsia="Arial" w:hAnsi="Arial"/>
-          <w:b w:val="0"/>
-          <w:bCs w:val="0"/>
-          <w:i w:val="0"/>
-          <w:iCs w:val="0"/>
-          <w:smallCaps w:val="0"/>
-          <w:strike w:val="0"/>
-          <w:color w:val="000000"/>
-          <w:sz w:val="33"/>
-          <w:szCs w:val="33"/>
-          <w:u w:val="none"/>
-          <w:shd w:fill="auto" w:val="clear"/>
-          <w:vertAlign w:val="baseline"/>
-        </w:rPr>
-      </w:pPr>
-      <w:r>
-        <w:rPr>
-          <w:rtl w:val="0"/>
-        </w:rPr>
-      </w:r>
-    </w:p>
-    <w:p>
-      <w:pPr>
-        <w:pStyle w:val="Heading1"/>
-        <w:numPr>
-          <w:ilvl w:val="0"/>
-          <w:numId w:val="1"/>
-        </w:numPr>
-        <w:tabs>
-          <w:tab w:val="left" w:leader="none" w:pos="696"/>
-        </w:tabs>
-        <w:ind w:left="696" w:hanging="370"/>
-        <w:rPr/>
-      </w:pPr>
-      <w:sdt>
-        <w:sdtPr>
-          <w:id w:val="545445306"/>
-          <w:tag w:val="goog_rdk_0"/>
-        </w:sdtPr>
-        <w:sdtContent>
-          <w:r>
-            <w:rPr>
-              <w:rFonts w:ascii="Arial Unicode MS" w:cs="Arial Unicode MS" w:eastAsia="Arial Unicode MS" w:hAnsi="Arial Unicode MS"/>
-              <w:rtl w:val="0"/>
-            </w:rPr>
-            <w:t xml:space="preserve">Deﬁnitions</w:t>
-          </w:r>
-        </w:sdtContent>
-      </w:sdt>
-    </w:p>
-    <w:p>
-      <w:pPr>
-        <w:spacing w:before="294" w:lineRule="auto"/>
-        <w:ind w:left="205" w:firstLine="0"/>
-        <w:jc w:val="center"/>
-        <w:rPr>
-          <w:b w:val="1"/>
-          <w:bCs w:val="1"/>
-          <w:i w:val="1"/>
-          <w:iCs w:val="1"/>
-          <w:sz w:val="25"/>
-          <w:szCs w:val="25"/>
-        </w:rPr>
-      </w:pPr>
-      <w:r>
-        <w:rPr>
-          <w:b w:val="1"/>
-          <w:bCs w:val="1"/>
-          <w:i w:val="1"/>
-          <w:iCs w:val="1"/>
-          <w:sz w:val="25"/>
-          <w:szCs w:val="25"/>
-          <w:rtl w:val="0"/>
-        </w:rPr>
-        <w:t>Table 4: Definitions of terms, acronyms, and abbreviations</w:t>
-      </w:r>
-    </w:p>
-    <w:p>
-      <w:pPr>
-        <w:keepNext w:val="0"/>
-        <w:keepLines w:val="0"/>
-        <w:pageBreakBefore w:val="0"/>
-        <w:widowControl w:val="0"/>
-        <w:pBdr>
-          <w:top w:space="0" w:sz="0" w:val="nil"/>
-          <w:left w:space="0" w:sz="0" w:val="nil"/>
-          <w:bottom w:space="0" w:sz="0" w:val="nil"/>
-          <w:right w:space="0" w:sz="0" w:val="nil"/>
-          <w:between w:space="0" w:sz="0" w:val="nil"/>
-        </w:pBdr>
-        <w:shd w:fill="auto" w:val="clear"/>
-        <w:spacing w:after="0" w:before="11" w:line="240" w:lineRule="auto"/>
-        <w:ind w:left="0" w:right="0" w:firstLine="0"/>
-        <w:jc w:val="left"/>
-        <w:rPr>
-          <w:rFonts w:ascii="Arial" w:cs="Arial" w:eastAsia="Arial" w:hAnsi="Arial"/>
-          <w:b w:val="1"/>
-          <w:bCs w:val="1"/>
-          <w:i w:val="1"/>
-          <w:iCs w:val="1"/>
-          <w:smallCaps w:val="0"/>
-          <w:strike w:val="0"/>
-          <w:color w:val="000000"/>
-          <w:sz w:val="14"/>
-          <w:szCs w:val="14"/>
-          <w:u w:val="none"/>
-          <w:shd w:fill="auto" w:val="clear"/>
-          <w:vertAlign w:val="baseline"/>
-        </w:rPr>
-      </w:pPr>
-      <w:r>
-        <w:rPr>
-          <w:rtl w:val="0"/>
-        </w:rPr>
-      </w:r>
-    </w:p>
-    <w:tbl>
-      <w:tblPr>
-        <w:tblStyle w:val="Table2"/>
-        <w:tblW w:w="9390.0" w:type="dxa"/>
-        <w:jc w:val="left"/>
-        <w:tblInd w:w="339.0" w:type="dxa"/>
-        <w:tblBorders>
-          <w:top w:color="b3b3b3" w:space="0" w:sz="6" w:val="single"/>
-          <w:left w:color="b3b3b3" w:space="0" w:sz="6" w:val="single"/>
-          <w:bottom w:color="b3b3b3" w:space="0" w:sz="6" w:val="single"/>
-          <w:right w:color="b3b3b3" w:space="0" w:sz="6" w:val="single"/>
-          <w:insideH w:color="b3b3b3" w:space="0" w:sz="6" w:val="single"/>
-          <w:insideV w:color="b3b3b3" w:space="0" w:sz="6" w:val="single"/>
-        </w:tblBorders>
-        <w:tblLayout w:type="fixed"/>
-        <w:tblLook w:val="0000"/>
-      </w:tblPr>
-      <w:tblGrid>
-        <w:gridCol w:w="2550"/>
-        <w:gridCol w:w="6840"/>
-        <w:tblGridChange w:id="0">
-          <w:tblGrid>
-            <w:gridCol w:w="2550"/>
-            <w:gridCol w:w="6840"/>
-          </w:tblGrid>
-        </w:tblGridChange>
-      </w:tblGrid>
-      <w:tr>
-        <w:trPr>
-          <w:cantSplit w:val="0"/>
-          <w:trHeight w:val="449" w:hRule="atLeast"/>
-          <w:tblHeader w:val="0"/>
-        </w:trPr>
-        <w:tc>
-          <w:tcPr>
-            <w:tcBorders>
-              <w:bottom w:color="bebebe" w:space="0" w:sz="6" w:val="single"/>
-              <w:right w:color="bebebe" w:space="0" w:sz="6" w:val="single"/>
-            </w:tcBorders>
-            <w:shd w:fill="efefef" w:val="clear"/>
-          </w:tcPr>
-          <w:p>
-            <w:pPr>
-              <w:keepNext w:val="0"/>
-              <w:keepLines w:val="0"/>
-              <w:widowControl w:val="0"/>
-              <w:pBdr>
-                <w:top w:space="0" w:sz="0" w:val="nil"/>
-                <w:left w:space="0" w:sz="0" w:val="nil"/>
-                <w:bottom w:space="0" w:sz="0" w:val="nil"/>
-                <w:right w:space="0" w:sz="0" w:val="nil"/>
-                <w:between w:space="0" w:sz="0" w:val="nil"/>
-              </w:pBdr>
-              <w:shd w:fill="auto" w:val="clear"/>
-              <w:spacing w:after="0" w:before="69" w:line="240" w:lineRule="auto"/>
-              <w:ind w:left="95" w:right="0" w:firstLine="0"/>
-              <w:jc w:val="left"/>
-              <w:rPr>
-                <w:rFonts w:ascii="Arial Black" w:cs="Arial Black" w:eastAsia="Arial Black" w:hAnsi="Arial Black"/>
-                <w:b w:val="0"/>
-                <w:bCs w:val="0"/>
-                <w:i w:val="0"/>
-                <w:iCs w:val="0"/>
-                <w:smallCaps w:val="0"/>
-                <w:strike w:val="0"/>
-                <w:color w:val="000000"/>
-                <w:sz w:val="21"/>
-                <w:szCs w:val="21"/>
-                <w:u w:val="none"/>
-                <w:shd w:fill="auto" w:val="clear"/>
-                <w:vertAlign w:val="baseline"/>
-              </w:rPr>
-            </w:pPr>
-            <w:r>
-              <w:rPr>
-                <w:rFonts w:ascii="Arial Black" w:cs="Arial Black" w:eastAsia="Arial Black" w:hAnsi="Arial Black"/>
-                <w:b w:val="0"/>
-                <w:bCs w:val="0"/>
-                <w:i w:val="0"/>
-                <w:iCs w:val="0"/>
-                <w:smallCaps w:val="0"/>
-                <w:strike w:val="0"/>
-                <w:color w:val="000000"/>
-                <w:sz w:val="21"/>
-                <w:szCs w:val="21"/>
-                <w:u w:val="none"/>
-                <w:shd w:fill="auto" w:val="clear"/>
-                <w:vertAlign w:val="baseline"/>
-                <w:rtl w:val="0"/>
-              </w:rPr>
-              <w:t xml:space="preserve">Term</w:t>
-            </w:r>
-          </w:p>
-        </w:tc>
-        <w:tc>
-          <w:tcPr>
-            <w:tcBorders>
-              <w:left w:color="bebebe" w:space="0" w:sz="6" w:val="single"/>
-              <w:bottom w:color="bebebe" w:space="0" w:sz="6" w:val="single"/>
-            </w:tcBorders>
-            <w:shd w:fill="efefef" w:val="clear"/>
-          </w:tcPr>
-          <w:p>
-            <w:pPr>
-              <w:keepNext w:val="0"/>
-              <w:keepLines w:val="0"/>
-              <w:widowControl w:val="0"/>
-              <w:pBdr>
-                <w:top w:space="0" w:sz="0" w:val="nil"/>
-                <w:left w:space="0" w:sz="0" w:val="nil"/>
-                <w:bottom w:space="0" w:sz="0" w:val="nil"/>
-                <w:right w:space="0" w:sz="0" w:val="nil"/>
-                <w:between w:space="0" w:sz="0" w:val="nil"/>
-              </w:pBdr>
-              <w:shd w:fill="auto" w:val="clear"/>
-              <w:spacing w:after="0" w:before="69" w:line="240" w:lineRule="auto"/>
-              <w:ind w:left="95" w:right="0" w:firstLine="0"/>
-              <w:jc w:val="left"/>
-              <w:rPr>
-                <w:rFonts w:ascii="Arial Black" w:cs="Arial Black" w:eastAsia="Arial Black" w:hAnsi="Arial Black"/>
-                <w:b w:val="0"/>
-                <w:bCs w:val="0"/>
-                <w:i w:val="0"/>
-                <w:iCs w:val="0"/>
-                <w:smallCaps w:val="0"/>
-                <w:strike w:val="0"/>
-                <w:color w:val="000000"/>
-                <w:sz w:val="21"/>
-                <w:szCs w:val="21"/>
-                <w:u w:val="none"/>
-                <w:shd w:fill="auto" w:val="clear"/>
-                <w:vertAlign w:val="baseline"/>
-              </w:rPr>
-            </w:pPr>
-            <w:sdt>
-              <w:sdtPr>
-                <w:id w:val="2032721005"/>
-                <w:tag w:val="goog_rdk_1"/>
-              </w:sdtPr>
-              <w:sdtContent>
-                <w:r>
-                  <w:rPr>
-                    <w:rFonts w:ascii="Arial Unicode MS" w:cs="Arial Unicode MS" w:eastAsia="Arial Unicode MS" w:hAnsi="Arial Unicode MS"/>
-                    <w:b w:val="0"/>
-                    <w:bCs w:val="0"/>
-                    <w:i w:val="0"/>
-                    <w:iCs w:val="0"/>
-                    <w:smallCaps w:val="0"/>
-                    <w:strike w:val="0"/>
-                    <w:color w:val="000000"/>
-                    <w:sz w:val="21"/>
-                    <w:szCs w:val="21"/>
-                    <w:u w:val="none"/>
-                    <w:shd w:fill="auto" w:val="clear"/>
-                    <w:vertAlign w:val="baseline"/>
-                    <w:rtl w:val="0"/>
-                  </w:rPr>
-                  <w:t xml:space="preserve">Deﬁnition</w:t>
-                </w:r>
-              </w:sdtContent>
-            </w:sdt>
-          </w:p>
-        </w:tc>
-      </w:tr>
-      <w:tr>
-        <w:trPr>
-          <w:cantSplit w:val="0"/>
-          <w:trHeight w:val="749" w:hRule="atLeast"/>
-          <w:tblHeader w:val="0"/>
-        </w:trPr>
-        <w:tc>
-          <w:tcPr>
-            <w:tcBorders>
-              <w:top w:color="bebebe" w:space="0" w:sz="6" w:val="single"/>
-              <w:bottom w:color="bebebe" w:space="0" w:sz="6" w:val="single"/>
-              <w:right w:color="bebebe" w:space="0" w:sz="6" w:val="single"/>
-            </w:tcBorders>
-          </w:tcPr>
-          <w:p>
-            <w:pPr>
-              <w:keepNext w:val="0"/>
-              <w:keepLines w:val="0"/>
-              <w:widowControl w:val="0"/>
-              <w:pBdr>
-                <w:top w:space="0" w:sz="0" w:val="nil"/>
-                <w:left w:space="0" w:sz="0" w:val="nil"/>
-                <w:bottom w:space="0" w:sz="0" w:val="nil"/>
-                <w:right w:space="0" w:sz="0" w:val="nil"/>
-                <w:between w:space="0" w:sz="0" w:val="nil"/>
-              </w:pBdr>
-              <w:shd w:fill="auto" w:val="clear"/>
-              <w:spacing w:after="0" w:before="0" w:line="240" w:lineRule="auto"/>
-              <w:ind w:left="95" w:right="0" w:firstLine="0"/>
-              <w:jc w:val="left"/>
-              <w:rPr>
-                <w:rFonts w:ascii="Arial" w:cs="Arial" w:eastAsia="Arial" w:hAnsi="Arial"/>
-                <w:b w:val="0"/>
-                <w:bCs w:val="0"/>
-                <w:i w:val="0"/>
-                <w:iCs w:val="0"/>
-                <w:smallCaps w:val="0"/>
-                <w:strike w:val="0"/>
-                <w:color w:val="000000"/>
-                <w:sz w:val="21"/>
-                <w:szCs w:val="21"/>
-                <w:u w:val="none"/>
-                <w:shd w:fill="auto" w:val="clear"/>
-                <w:vertAlign w:val="baseline"/>
-              </w:rPr>
-            </w:pPr>
-            <w:r>
-              <w:rPr>
-                <w:rtl w:val="0"/>
-              </w:rPr>
-            </w:r>
-          </w:p>
-        </w:tc>
-        <w:tc>
-          <w:tcPr>
-            <w:tcBorders>
-              <w:top w:color="bebebe" w:space="0" w:sz="6" w:val="single"/>
-              <w:left w:color="bebebe" w:space="0" w:sz="6" w:val="single"/>
-              <w:bottom w:color="bebebe" w:space="0" w:sz="6" w:val="single"/>
-            </w:tcBorders>
-          </w:tcPr>
-          <w:p>
-            <w:pPr>
-              <w:keepNext w:val="0"/>
-              <w:keepLines w:val="0"/>
-              <w:widowControl w:val="0"/>
-              <w:pBdr>
-                <w:top w:space="0" w:sz="0" w:val="nil"/>
-                <w:left w:space="0" w:sz="0" w:val="nil"/>
-                <w:bottom w:space="0" w:sz="0" w:val="nil"/>
-                <w:right w:space="0" w:sz="0" w:val="nil"/>
-                <w:between w:space="0" w:sz="0" w:val="nil"/>
-              </w:pBdr>
-              <w:shd w:fill="auto" w:val="clear"/>
-              <w:spacing w:after="0" w:before="103" w:line="297" w:lineRule="auto"/>
-              <w:ind w:left="95" w:right="120" w:firstLine="0"/>
-              <w:jc w:val="left"/>
-              <w:rPr>
-                <w:rFonts w:ascii="Arial" w:cs="Arial" w:eastAsia="Arial" w:hAnsi="Arial"/>
-                <w:b w:val="0"/>
-                <w:bCs w:val="0"/>
-                <w:i w:val="0"/>
-                <w:iCs w:val="0"/>
-                <w:smallCaps w:val="0"/>
-                <w:strike w:val="0"/>
-                <w:color w:val="000000"/>
-                <w:sz w:val="21"/>
-                <w:szCs w:val="21"/>
-                <w:u w:val="none"/>
-                <w:shd w:fill="auto" w:val="clear"/>
-                <w:vertAlign w:val="baseline"/>
-              </w:rPr>
-            </w:pPr>
-            <w:r>
-              <w:rPr>
-                <w:rtl w:val="0"/>
-              </w:rPr>
-            </w:r>
-          </w:p>
-        </w:tc>
-      </w:tr>
-      <w:tr>
-        <w:trPr>
-          <w:cantSplit w:val="0"/>
-          <w:trHeight w:val="749" w:hRule="atLeast"/>
-          <w:tblHeader w:val="0"/>
-        </w:trPr>
-        <w:tc>
-          <w:tcPr>
-            <w:tcBorders>
-              <w:top w:color="bebebe" w:space="0" w:sz="6" w:val="single"/>
-              <w:bottom w:color="bebebe" w:space="0" w:sz="6" w:val="single"/>
-              <w:right w:color="bebebe" w:space="0" w:sz="6" w:val="single"/>
-            </w:tcBorders>
-          </w:tcPr>
-          <w:p>
-            <w:pPr>
-              <w:keepNext w:val="0"/>
-              <w:keepLines w:val="0"/>
-              <w:widowControl w:val="0"/>
-              <w:pBdr>
-                <w:top w:space="0" w:sz="0" w:val="nil"/>
-                <w:left w:space="0" w:sz="0" w:val="nil"/>
-                <w:bottom w:space="0" w:sz="0" w:val="nil"/>
-                <w:right w:space="0" w:sz="0" w:val="nil"/>
-                <w:between w:space="0" w:sz="0" w:val="nil"/>
-              </w:pBdr>
-              <w:shd w:fill="auto" w:val="clear"/>
-              <w:spacing w:after="0" w:before="0" w:line="240" w:lineRule="auto"/>
-              <w:ind w:left="95" w:right="0" w:firstLine="0"/>
-              <w:jc w:val="left"/>
-              <w:rPr>
-                <w:rFonts w:ascii="Arial" w:cs="Arial" w:eastAsia="Arial" w:hAnsi="Arial"/>
-                <w:b w:val="0"/>
-                <w:bCs w:val="0"/>
-                <w:i w:val="0"/>
-                <w:iCs w:val="0"/>
-                <w:smallCaps w:val="0"/>
-                <w:strike w:val="0"/>
-                <w:color w:val="000000"/>
-                <w:sz w:val="21"/>
-                <w:szCs w:val="21"/>
-                <w:u w:val="none"/>
-                <w:shd w:fill="auto" w:val="clear"/>
-                <w:vertAlign w:val="baseline"/>
-              </w:rPr>
-            </w:pPr>
-            <w:r>
-              <w:rPr>
-                <w:rtl w:val="0"/>
-              </w:rPr>
-            </w:r>
-          </w:p>
-        </w:tc>
-        <w:tc>
-          <w:tcPr>
-            <w:tcBorders>
-              <w:top w:color="bebebe" w:space="0" w:sz="6" w:val="single"/>
-              <w:left w:color="bebebe" w:space="0" w:sz="6" w:val="single"/>
-              <w:bottom w:color="bebebe" w:space="0" w:sz="6" w:val="single"/>
-            </w:tcBorders>
-          </w:tcPr>
-          <w:p>
-            <w:pPr>
-              <w:keepNext w:val="0"/>
-              <w:keepLines w:val="0"/>
-              <w:widowControl w:val="0"/>
-              <w:pBdr>
-                <w:top w:space="0" w:sz="0" w:val="nil"/>
-                <w:left w:space="0" w:sz="0" w:val="nil"/>
-                <w:bottom w:space="0" w:sz="0" w:val="nil"/>
-                <w:right w:space="0" w:sz="0" w:val="nil"/>
-                <w:between w:space="0" w:sz="0" w:val="nil"/>
-              </w:pBdr>
-              <w:shd w:fill="auto" w:val="clear"/>
-              <w:spacing w:after="0" w:before="103" w:line="297" w:lineRule="auto"/>
-              <w:ind w:left="95" w:right="0" w:firstLine="0"/>
-              <w:jc w:val="left"/>
-              <w:rPr>
-                <w:rFonts w:ascii="Arial" w:cs="Arial" w:eastAsia="Arial" w:hAnsi="Arial"/>
-                <w:b w:val="0"/>
-                <w:bCs w:val="0"/>
-                <w:i w:val="0"/>
-                <w:iCs w:val="0"/>
-                <w:smallCaps w:val="0"/>
-                <w:strike w:val="0"/>
-                <w:color w:val="000000"/>
-                <w:sz w:val="21"/>
-                <w:szCs w:val="21"/>
-                <w:u w:val="none"/>
-                <w:shd w:fill="auto" w:val="clear"/>
-                <w:vertAlign w:val="baseline"/>
-              </w:rPr>
-            </w:pPr>
-            <w:r>
-              <w:rPr>
-                <w:rtl w:val="0"/>
-              </w:rPr>
-            </w:r>
-          </w:p>
-        </w:tc>
-      </w:tr>
-      <w:tr>
-        <w:trPr>
-          <w:cantSplit w:val="0"/>
-          <w:trHeight w:val="749" w:hRule="atLeast"/>
-          <w:tblHeader w:val="0"/>
-        </w:trPr>
-        <w:tc>
-          <w:tcPr>
-            <w:tcBorders>
-              <w:top w:color="bebebe" w:space="0" w:sz="6" w:val="single"/>
-              <w:right w:color="bebebe" w:space="0" w:sz="6" w:val="single"/>
-            </w:tcBorders>
-          </w:tcPr>
-          <w:p>
-            <w:pPr>
-              <w:keepNext w:val="0"/>
-              <w:keepLines w:val="0"/>
-              <w:widowControl w:val="0"/>
-              <w:pBdr>
-                <w:top w:space="0" w:sz="0" w:val="nil"/>
-                <w:left w:space="0" w:sz="0" w:val="nil"/>
-                <w:bottom w:space="0" w:sz="0" w:val="nil"/>
-                <w:right w:space="0" w:sz="0" w:val="nil"/>
-                <w:between w:space="0" w:sz="0" w:val="nil"/>
-              </w:pBdr>
-              <w:shd w:fill="auto" w:val="clear"/>
-              <w:spacing w:after="0" w:before="0" w:line="240" w:lineRule="auto"/>
-              <w:ind w:left="95" w:right="0" w:firstLine="0"/>
-              <w:jc w:val="left"/>
-              <w:rPr>
-                <w:rFonts w:ascii="Arial" w:cs="Arial" w:eastAsia="Arial" w:hAnsi="Arial"/>
-                <w:b w:val="0"/>
-                <w:bCs w:val="0"/>
-                <w:i w:val="0"/>
-                <w:iCs w:val="0"/>
-                <w:smallCaps w:val="0"/>
-                <w:strike w:val="0"/>
-                <w:color w:val="000000"/>
-                <w:sz w:val="21"/>
-                <w:szCs w:val="21"/>
-                <w:u w:val="none"/>
-                <w:shd w:fill="auto" w:val="clear"/>
-                <w:vertAlign w:val="baseline"/>
-              </w:rPr>
-            </w:pPr>
-            <w:r>
-              <w:rPr>
-                <w:rtl w:val="0"/>
-              </w:rPr>
-            </w:r>
-          </w:p>
-        </w:tc>
-        <w:tc>
-          <w:tcPr>
-            <w:tcBorders>
-              <w:top w:color="bebebe" w:space="0" w:sz="6" w:val="single"/>
-              <w:left w:color="bebebe" w:space="0" w:sz="6" w:val="single"/>
-            </w:tcBorders>
-          </w:tcPr>
-          <w:p>
-            <w:pPr>
-              <w:keepNext w:val="0"/>
-              <w:keepLines w:val="0"/>
-              <w:widowControl w:val="0"/>
-              <w:pBdr>
-                <w:top w:space="0" w:sz="0" w:val="nil"/>
-                <w:left w:space="0" w:sz="0" w:val="nil"/>
-                <w:bottom w:space="0" w:sz="0" w:val="nil"/>
-                <w:right w:space="0" w:sz="0" w:val="nil"/>
-                <w:between w:space="0" w:sz="0" w:val="nil"/>
-              </w:pBdr>
-              <w:shd w:fill="auto" w:val="clear"/>
-              <w:spacing w:after="0" w:before="103" w:line="297" w:lineRule="auto"/>
-              <w:ind w:left="95" w:right="0" w:firstLine="0"/>
-              <w:jc w:val="left"/>
-              <w:rPr>
-                <w:rFonts w:ascii="Arial" w:cs="Arial" w:eastAsia="Arial" w:hAnsi="Arial"/>
-                <w:b w:val="0"/>
-                <w:bCs w:val="0"/>
-                <w:i w:val="0"/>
-                <w:iCs w:val="0"/>
-                <w:smallCaps w:val="0"/>
-                <w:strike w:val="0"/>
-                <w:color w:val="000000"/>
-                <w:sz w:val="21"/>
-                <w:szCs w:val="21"/>
-                <w:u w:val="none"/>
-                <w:shd w:fill="auto" w:val="clear"/>
-                <w:vertAlign w:val="baseline"/>
-              </w:rPr>
-            </w:pPr>
-            <w:r>
-              <w:rPr>
-                <w:rtl w:val="0"/>
-              </w:rPr>
-            </w:r>
-          </w:p>
-        </w:tc>
-      </w:tr>
-    </w:tbl>
-    <w:p>
-      <w:pPr>
-        <w:keepNext w:val="0"/>
-        <w:keepLines w:val="0"/>
-        <w:pageBreakBefore w:val="0"/>
-        <w:widowControl w:val="0"/>
-        <w:pBdr>
-          <w:top w:space="0" w:sz="0" w:val="nil"/>
-          <w:left w:space="0" w:sz="0" w:val="nil"/>
-          <w:bottom w:space="0" w:sz="0" w:val="nil"/>
-          <w:right w:space="0" w:sz="0" w:val="nil"/>
-          <w:between w:space="0" w:sz="0" w:val="nil"/>
-        </w:pBdr>
-        <w:shd w:fill="auto" w:val="clear"/>
-        <w:spacing w:after="0" w:before="133" w:line="240" w:lineRule="auto"/>
-        <w:ind w:left="0" w:right="0" w:firstLine="0"/>
-        <w:jc w:val="left"/>
-        <w:rPr>
-          <w:rFonts w:ascii="Arial" w:cs="Arial" w:eastAsia="Arial" w:hAnsi="Arial"/>
-          <w:b w:val="1"/>
-          <w:bCs w:val="1"/>
-          <w:i w:val="1"/>
-          <w:iCs w:val="1"/>
-          <w:smallCaps w:val="0"/>
-          <w:strike w:val="0"/>
-          <w:color w:val="000000"/>
-          <w:sz w:val="25"/>
-          <w:szCs w:val="25"/>
-          <w:u w:val="none"/>
-          <w:shd w:fill="auto" w:val="clear"/>
-          <w:vertAlign w:val="baseline"/>
-        </w:rPr>
-      </w:pPr>
-      <w:r>
-        <w:rPr>
-          <w:rtl w:val="0"/>
-        </w:rPr>
-      </w:r>
-    </w:p>
-    <w:p>
-      <w:pPr>
-        <w:pStyle w:val="Heading1"/>
-        <w:pageBreakBefore/>
-        <w:numPr>
-          <w:ilvl w:val="0"/>
-          <w:numId w:val="1"/>
-        </w:numPr>
-        <w:tabs>
-          <w:tab w:val="left" w:leader="none" w:pos="696"/>
-        </w:tabs>
-        <w:ind w:left="696" w:hanging="370"/>
-        <w:rPr/>
-      </w:pPr>
-      <w:r>
-        <w:rPr>
-          <w:rtl w:val="0"/>
-        </w:rPr>
-        <w:t xml:space="preserve">Responsibilities</w:t>
-      </w:r>
-    </w:p>
-    <w:p>
-      <w:pPr>
-        <w:keepNext w:val="0"/>
-        <w:keepLines w:val="0"/>
-        <w:pageBreakBefore w:val="0"/>
-        <w:widowControl w:val="0"/>
-        <w:numPr>
-          <w:ilvl w:val="1"/>
-          <w:numId w:val="1"/>
-        </w:numPr>
-        <w:pBdr>
-          <w:top w:space="0" w:sz="0" w:val="nil"/>
-          <w:left w:space="0" w:sz="0" w:val="nil"/>
-          <w:bottom w:space="0" w:sz="0" w:val="nil"/>
-          <w:right w:space="0" w:sz="0" w:val="nil"/>
-          <w:between w:space="0" w:sz="0" w:val="nil"/>
-        </w:pBdr>
-        <w:shd w:fill="auto" w:val="clear"/>
-        <w:tabs>
-          <w:tab w:val="left" w:leader="none" w:pos="1016"/>
-        </w:tabs>
-        <w:spacing w:after="0" w:before="282" w:line="240" w:lineRule="auto"/>
-        <w:ind w:left="1016" w:right="0" w:hanging="453"/>
-        <w:jc w:val="left"/>
-        <w:rPr>
-          <w:rFonts w:ascii="Arial" w:cs="Arial" w:eastAsia="Arial" w:hAnsi="Arial"/>
-          <w:b w:val="0"/>
-          <w:bCs w:val="0"/>
-          <w:i w:val="0"/>
-          <w:iCs w:val="0"/>
-          <w:smallCaps w:val="0"/>
-          <w:strike w:val="0"/>
-          <w:color w:val="000000"/>
-          <w:sz w:val="21"/>
-          <w:szCs w:val="21"/>
-          <w:u w:val="none"/>
-          <w:shd w:fill="auto" w:val="clear"/>
-          <w:vertAlign w:val="baseline"/>
-        </w:rPr>
-      </w:pPr>
-      <w:r>
-        <w:rPr>
-          <w:rFonts w:ascii="Arial" w:cs="Arial" w:eastAsia="Arial" w:hAnsi="Arial"/>
-          <w:b w:val="0"/>
-          <w:bCs w:val="0"/>
-          <w:i w:val="0"/>
-          <w:iCs w:val="0"/>
-          <w:smallCaps w:val="0"/>
-          <w:strike w:val="0"/>
-          <w:color w:val="000000"/>
-          <w:sz w:val="21"/>
-          <w:szCs w:val="21"/>
-          <w:u w:val="none"/>
-          <w:shd w:fill="auto" w:val="clear"/>
-          <w:vertAlign w:val="baseline"/>
-          <w:rtl w:val="0"/>
-        </w:rPr>
-        <w:t xml:space="preserve">It is the responsibility of persons operating </w:t>
-      </w:r>
-      <w:r>
-        <w:rPr>
-          <w:rFonts w:ascii="Arial Black" w:cs="Arial Black" w:eastAsia="Arial Black" w:hAnsi="Arial Black"/>
-          <w:b w:val="0"/>
-          <w:bCs w:val="0"/>
-          <w:i w:val="0"/>
-          <w:iCs w:val="0"/>
-          <w:smallCaps w:val="0"/>
-          <w:strike w:val="0"/>
-          <w:color w:val="40a75e"/>
-          <w:sz w:val="21"/>
-          <w:szCs w:val="21"/>
-          <w:u w:val="none"/>
-          <w:shd w:fill="auto" w:val="clear"/>
-          <w:vertAlign w:val="baseline"/>
-          <w:rtl w:val="0"/>
-        </w:rPr>
-        <w:t xml:space="preserve">PROBE08 </w:t>
-      </w:r>
-      <w:r>
-        <w:rPr>
-          <w:rFonts w:ascii="Arial" w:cs="Arial" w:eastAsia="Arial" w:hAnsi="Arial"/>
-          <w:b w:val="0"/>
-          <w:bCs w:val="0"/>
-          <w:i w:val="0"/>
-          <w:iCs w:val="0"/>
-          <w:smallCaps w:val="0"/>
-          <w:strike w:val="0"/>
-          <w:color w:val="000000"/>
-          <w:sz w:val="21"/>
-          <w:szCs w:val="21"/>
-          <w:u w:val="none"/>
-          <w:shd w:fill="auto" w:val="clear"/>
-          <w:vertAlign w:val="baseline"/>
-          <w:rtl w:val="0"/>
-        </w:rPr>
-        <w:t xml:space="preserve">to read this document.</w:t>
-      </w:r>
-    </w:p>
-    <w:p>
-      <w:pPr>
-        <w:keepNext w:val="0"/>
-        <w:keepLines w:val="0"/>
-        <w:pageBreakBefore w:val="0"/>
-        <w:widowControl w:val="0"/>
-        <w:numPr>
-          <w:ilvl w:val="1"/>
-          <w:numId w:val="1"/>
-        </w:numPr>
-        <w:pBdr>
-          <w:top w:space="0" w:sz="0" w:val="nil"/>
-          <w:left w:space="0" w:sz="0" w:val="nil"/>
-          <w:bottom w:space="0" w:sz="0" w:val="nil"/>
-          <w:right w:space="0" w:sz="0" w:val="nil"/>
-          <w:between w:space="0" w:sz="0" w:val="nil"/>
-        </w:pBdr>
-        <w:shd w:fill="auto" w:val="clear"/>
-        <w:tabs>
-          <w:tab w:val="left" w:leader="none" w:pos="1016"/>
-        </w:tabs>
-        <w:spacing w:after="0" w:before="188" w:line="240" w:lineRule="auto"/>
-        <w:ind w:left="1016" w:right="0" w:hanging="453"/>
-        <w:jc w:val="left"/>
-        <w:rPr>
-          <w:rFonts w:ascii="Arial" w:cs="Arial" w:eastAsia="Arial" w:hAnsi="Arial"/>
-          <w:b w:val="0"/>
-          <w:bCs w:val="0"/>
-          <w:i w:val="0"/>
-          <w:iCs w:val="0"/>
-          <w:smallCaps w:val="0"/>
-          <w:strike w:val="0"/>
-          <w:color w:val="000000"/>
-          <w:sz w:val="21"/>
-          <w:szCs w:val="21"/>
-          <w:u w:val="none"/>
-          <w:shd w:fill="auto" w:val="clear"/>
-          <w:vertAlign w:val="baseline"/>
-        </w:rPr>
-        <w:sectPr>
-          <w:type w:val="nextPage"/>
-          <w:pgSz w:h="16840" w:w="11900" w:orient="portrait"/>
-          <w:pgMar w:bottom="840" w:top="1100" w:left="1020" w:right="1020" w:header="824" w:footer="643"/>
-        </w:sectPr>
-      </w:pPr>
-      <w:r>
-        <w:rPr>
-          <w:rFonts w:ascii="Arial" w:cs="Arial" w:eastAsia="Arial" w:hAnsi="Arial"/>
-          <w:b w:val="0"/>
-          <w:bCs w:val="0"/>
-          <w:i w:val="0"/>
-          <w:iCs w:val="0"/>
-          <w:smallCaps w:val="0"/>
-          <w:strike w:val="0"/>
-          <w:color w:val="000000"/>
-          <w:sz w:val="21"/>
-          <w:szCs w:val="21"/>
-          <w:u w:val="none"/>
-          <w:shd w:fill="auto" w:val="clear"/>
-          <w:vertAlign w:val="baseline"/>
-          <w:rtl w:val="0"/>
-        </w:rPr>
-        <w:t xml:space="preserve">It is the responsibility of the Metrology Engineer to maintain this document.</w:t>
-      </w:r>
-    </w:p>
-    <w:p>
-      <w:pPr>
-        <w:tabs>
-          <w:tab w:val="left" w:leader="none" w:pos="9067"/>
-        </w:tabs>
-        <w:spacing w:before="51" w:lineRule="auto"/>
-        <w:ind w:left="114" w:firstLine="0"/>
-        <w:rPr>
-          <w:sz w:val="18"/>
-          <w:szCs w:val="18"/>
-        </w:rPr>
-      </w:pPr>
-      <w:r>
-        <w:rPr>
-          <w:sz w:val="18"/>
-          <w:szCs w:val="18"/>
-          <w:rtl w:val="0"/>
-        </w:rPr>
-        <w:t xml:space="preserve">Atomica Corp.</w:t>
-        <w:tab/>
-        <w:t xml:space="preserve">EOI-249</w:t>
-      </w:r>
-    </w:p>
-    <w:p>
-      <w:pPr>
-        <w:tabs>
-          <w:tab w:val="left" w:leader="none" w:pos="8738"/>
-        </w:tabs>
-        <w:spacing w:before="93" w:lineRule="auto"/>
-        <w:ind w:left="114" w:firstLine="0"/>
-        <w:rPr>
-          <w:sz w:val="18"/>
-          <w:szCs w:val="18"/>
-        </w:rPr>
-      </w:pPr>
-      <w:r>
-        <w:rPr>
-          <w:sz w:val="18"/>
-          <w:szCs w:val="18"/>
-          <w:rtl w:val="0"/>
-        </w:rPr>
-        <w:t xml:space="preserve">Operation of PROBE08 (Accretech UF200R)</w:t>
-        <w:tab/>
-        <w:t xml:space="preserve">Version: 4.0</w:t>
-      </w:r>
-      <w:r>
-        <mc:AlternateContent>
-          <mc:Choice Requires="wpg">
-            <w:drawing>
-              <wp:anchor allowOverlap="1" behindDoc="0" distB="0" distT="0" distL="0" distR="0" hidden="0" layoutInCell="1" locked="0" relativeHeight="0" simplePos="0">
-                <wp:simplePos x="0" y="0"/>
-                <wp:positionH relativeFrom="column">
-                  <wp:posOffset>66979</wp:posOffset>
-                </wp:positionH>
-                <wp:positionV relativeFrom="paragraph">
-                  <wp:posOffset>207817</wp:posOffset>
-                </wp:positionV>
-                <wp:extent cx="6130925" cy="31750"/>
-                <wp:effectExtent b="0" l="0" r="0" t="0"/>
-                <wp:wrapTopAndBottom distB="0" distT="0"/>
-                <wp:docPr id="5" name=""/>
-                <a:graphic>
-                  <a:graphicData uri="http://schemas.microsoft.com/office/word/2010/wordprocessingShape">
-                    <wps:wsp>
-                      <wps:cNvSpPr/>
-                      <wps:cNvPr id="6" name="Shape 6"/>
-                      <wps:spPr>
-                        <a:xfrm>
-                          <a:off x="2290063" y="3773650"/>
-                          <a:ext cx="6111875" cy="12700"/>
-                        </a:xfrm>
-                        <a:custGeom>
-                          <a:rect b="b" l="l" r="r" t="t"/>
-                          <a:pathLst>
-                            <a:path extrusionOk="0" h="12700" w="6111875">
-                              <a:moveTo>
-                                <a:pt x="6111266" y="12705"/>
-                              </a:moveTo>
-                              <a:lnTo>
-                                <a:pt x="0" y="12705"/>
-                              </a:lnTo>
-                              <a:lnTo>
-                                <a:pt x="0" y="0"/>
-                              </a:lnTo>
-                              <a:lnTo>
-                                <a:pt x="6111266" y="0"/>
-                              </a:lnTo>
-                              <a:lnTo>
-                                <a:pt x="6111266" y="12705"/>
-                              </a:lnTo>
-                              <a:close/>
-                            </a:path>
-                          </a:pathLst>
-                        </a:custGeom>
-                        <a:solidFill>
-                          <a:srgbClr val="CCCCCC"/>
-                        </a:solidFill>
-                        <a:ln>
-                          <a:noFill/>
-                        </a:ln>
-                      </wps:spPr>
-                      <wps:bodyPr anchorCtr="0" anchor="ctr" bIns="91425" lIns="91425" spcFirstLastPara="1" rIns="91425" wrap="square" tIns="91425">
-                        <a:noAutofit/>
-                      </wps:bodyPr>
-                    </wps:wsp>
-                  </a:graphicData>
-                </a:graphic>
-              </wp:anchor>
-            </w:drawing>
-          </mc:Choice>
-          <mc:Fallback>
-            <w:drawing>
-              <wp:anchor allowOverlap="1" behindDoc="0" distB="0" distT="0" distL="0" distR="0" hidden="0" layoutInCell="1" locked="0" relativeHeight="0" simplePos="0">
-                <wp:simplePos x="0" y="0"/>
-                <wp:positionH relativeFrom="column">
-                  <wp:posOffset>66979</wp:posOffset>
-                </wp:positionH>
-                <wp:positionV relativeFrom="paragraph">
-                  <wp:posOffset>207817</wp:posOffset>
-                </wp:positionV>
-                <wp:extent cx="6130925" cy="31750"/>
-                <wp:effectExtent b="0" l="0" r="0" t="0"/>
-                <wp:wrapTopAndBottom distB="0" distT="0"/>
-                <wp:docPr id="5" name="image22.png"/>
-                <a:graphic>
-                  <a:graphicData uri="http://schemas.openxmlformats.org/drawingml/2006/picture">
-                    <pic:pic>
-                      <pic:nvPicPr>
-                        <pic:cNvPr id="0" name="image22.png"/>
                         <pic:cNvPicPr preferRelativeResize="0"/>
                       </pic:nvPicPr>
                       <pic:blipFill>

</xml_diff>